<commit_message>
feat(gateway): adopt Traefik as unified edge ingress and API gateway
- Author ADR-001 (docs/architecture/adr-001-traefik-ingress.md) defining Traefik edge proxy architecture
- Implement initial Traefik static configuration (deploy/gateway/traefik/traefik.yml)
- Implement dynamic routing, CORS, 10MB upload limit, and rate limiting middlewares (deploy/gateway/traefik/dynamic-routes.yml)
- Add living gateway documentation (deploy/gateway/README.md)
- Update specifications across SwiftDrop_SRS_v1 (.md/.docx/.pdf) and SwiftDrop_Team_Work_Division_v1.0 (.md/.docx/.pdf)
- Update system topology and Member 7 mappings across README.md, AGENTS.md, domain-boundaries.md, and web/README.md
</commit_message>
<xml_diff>
--- a/docs/intial/SwiftDrop_SRS_v1.0.docx
+++ b/docs/intial/SwiftDrop_SRS_v1.0.docx
@@ -18210,17 +18210,8 @@
             <w:shd w:fill="F2F6FA"/>
           </w:tcPr>
           <w:p>
-            <w:pPr>
-              <w:spacing w:after="20"/>
-            </w:pPr>
-            <w:r/>
-            <w:r>
-              <w:rPr>
-                <w:rFonts w:ascii="Aptos" w:hAnsi="Aptos"/>
-                <w:b w:val="0"/>
-                <w:sz w:val="16"/>
-              </w:rPr>
-              <w:t>Kong Gateway/Ingress integration or another single documented implementation; avoid duplicate proxies without purpose</w:t>
+            <w:r>
+              <w:t>Traefik Ingress Controller/Gateway integration (single unified proxy hop); avoid duplicate proxies without purpose</w:t>
             </w:r>
           </w:p>
         </w:tc>

</xml_diff>